<commit_message>
collab plan checklist change
</commit_message>
<xml_diff>
--- a/docs/Collaboration Plan.docx
+++ b/docs/Collaboration Plan.docx
@@ -84,6 +84,110 @@
       <w:pPr>
         <w:numPr>
           <w:ilvl w:val="0"/>
+          <w:numId w:val="3"/>
+        </w:numPr>
+        <w:ind w:left="720" w:hanging="360"/>
+        <w:rPr/>
+      </w:pPr>
+      <w:r>
+        <w:rPr>
+          <w:rtl w:val="0"/>
+        </w:rPr>
+        <w:t xml:space="preserve">Designed the model and keyed animations for enemy</w:t>
+      </w:r>
+    </w:p>
+    <w:p>
+      <w:pPr>
+        <w:numPr>
+          <w:ilvl w:val="0"/>
+          <w:numId w:val="3"/>
+        </w:numPr>
+        <w:ind w:left="720" w:hanging="360"/>
+        <w:rPr/>
+      </w:pPr>
+      <w:r>
+        <w:rPr>
+          <w:rtl w:val="0"/>
+        </w:rPr>
+        <w:t xml:space="preserve">Test level setup</w:t>
+      </w:r>
+    </w:p>
+    <w:p>
+      <w:pPr>
+        <w:numPr>
+          <w:ilvl w:val="0"/>
+          <w:numId w:val="3"/>
+        </w:numPr>
+        <w:ind w:left="720" w:hanging="360"/>
+        <w:rPr/>
+      </w:pPr>
+      <w:r>
+        <w:rPr>
+          <w:strike w:val="1"/>
+          <w:rtl w:val="0"/>
+        </w:rPr>
+        <w:t xml:space="preserve">Enemy AI</w:t>
+      </w:r>
+    </w:p>
+    <w:p>
+      <w:pPr>
+        <w:numPr>
+          <w:ilvl w:val="0"/>
+          <w:numId w:val="3"/>
+        </w:numPr>
+        <w:ind w:left="720" w:hanging="360"/>
+        <w:rPr/>
+      </w:pPr>
+      <w:r>
+        <w:rPr>
+          <w:rtl w:val="0"/>
+        </w:rPr>
+        <w:t xml:space="preserve">Set up player model</w:t>
+      </w:r>
+    </w:p>
+    <w:p>
+      <w:pPr>
+        <w:numPr>
+          <w:ilvl w:val="0"/>
+          <w:numId w:val="3"/>
+        </w:numPr>
+        <w:ind w:left="720" w:hanging="360"/>
+        <w:rPr/>
+      </w:pPr>
+      <w:r>
+        <w:rPr>
+          <w:strike w:val="1"/>
+          <w:rtl w:val="0"/>
+        </w:rPr>
+        <w:t xml:space="preserve">Main menu system</w:t>
+      </w:r>
+    </w:p>
+    <w:p>
+      <w:pPr>
+        <w:ind w:left="0" w:firstLine="0"/>
+        <w:rPr/>
+      </w:pPr>
+      <w:r>
+        <w:rPr>
+          <w:rtl w:val="0"/>
+        </w:rPr>
+      </w:r>
+    </w:p>
+    <w:p>
+      <w:pPr>
+        <w:rPr/>
+      </w:pPr>
+      <w:r>
+        <w:rPr>
+          <w:rtl w:val="0"/>
+        </w:rPr>
+        <w:t xml:space="preserve">Jiawei Song (jiaweis7):</w:t>
+      </w:r>
+    </w:p>
+    <w:p>
+      <w:pPr>
+        <w:numPr>
+          <w:ilvl w:val="0"/>
           <w:numId w:val="2"/>
         </w:numPr>
         <w:ind w:left="720" w:hanging="360"/>
@@ -93,279 +197,161 @@
         <w:rPr>
           <w:rtl w:val="0"/>
         </w:rPr>
-        <w:t xml:space="preserve">Designed the model and keyed animations for enemy</w:t>
-      </w:r>
-    </w:p>
-    <w:p>
-      <w:pPr>
-        <w:numPr>
-          <w:ilvl w:val="0"/>
-          <w:numId w:val="3"/>
-        </w:numPr>
-        <w:ind w:left="720" w:hanging="360"/>
-        <w:rPr/>
+        <w:t xml:space="preserve">Create mansion map</w:t>
+      </w:r>
+    </w:p>
+    <w:p>
+      <w:pPr>
+        <w:numPr>
+          <w:ilvl w:val="1"/>
+          <w:numId w:val="2"/>
+        </w:numPr>
+        <w:ind w:left="1440" w:hanging="360"/>
+        <w:rPr/>
+      </w:pPr>
+      <w:r>
+        <w:rPr>
+          <w:rtl w:val="0"/>
+        </w:rPr>
+        <w:t xml:space="preserve">Create mansion map textures and assets</w:t>
+      </w:r>
+    </w:p>
+    <w:p>
+      <w:pPr>
+        <w:numPr>
+          <w:ilvl w:val="1"/>
+          <w:numId w:val="2"/>
+        </w:numPr>
+        <w:ind w:left="1440" w:hanging="360"/>
+        <w:rPr/>
+      </w:pPr>
+      <w:r>
+        <w:rPr>
+          <w:rtl w:val="0"/>
+        </w:rPr>
+        <w:t xml:space="preserve">Add object interaction</w:t>
+      </w:r>
+    </w:p>
+    <w:p>
+      <w:pPr>
+        <w:numPr>
+          <w:ilvl w:val="0"/>
+          <w:numId w:val="2"/>
+        </w:numPr>
+        <w:ind w:left="720" w:hanging="360"/>
+        <w:rPr/>
+      </w:pPr>
+      <w:r>
+        <w:rPr>
+          <w:rtl w:val="0"/>
+        </w:rPr>
+        <w:t xml:space="preserve">Design features into game level</w:t>
+      </w:r>
+    </w:p>
+    <w:p>
+      <w:pPr>
+        <w:numPr>
+          <w:ilvl w:val="1"/>
+          <w:numId w:val="2"/>
+        </w:numPr>
+        <w:ind w:left="1440" w:hanging="360"/>
+        <w:rPr>
+          <w:u w:val="none"/>
+        </w:rPr>
+      </w:pPr>
+      <w:r>
+        <w:rPr>
+          <w:rtl w:val="0"/>
+        </w:rPr>
+        <w:t xml:space="preserve">Puzzles</w:t>
+      </w:r>
+    </w:p>
+    <w:p>
+      <w:pPr>
+        <w:numPr>
+          <w:ilvl w:val="1"/>
+          <w:numId w:val="2"/>
+        </w:numPr>
+        <w:ind w:left="1440" w:hanging="360"/>
+      </w:pPr>
+      <w:r>
+        <w:rPr>
+          <w:strike w:val="1"/>
+          <w:rtl w:val="0"/>
+        </w:rPr>
+        <w:t xml:space="preserve">Interact key prompt UI</w:t>
+      </w:r>
+    </w:p>
+    <w:p>
+      <w:pPr>
+        <w:numPr>
+          <w:ilvl w:val="1"/>
+          <w:numId w:val="2"/>
+        </w:numPr>
+        <w:ind w:left="1440" w:hanging="360"/>
+        <w:rPr>
+          <w:u w:val="none"/>
+        </w:rPr>
+      </w:pPr>
+      <w:r>
+        <w:rPr>
+          <w:rtl w:val="0"/>
+        </w:rPr>
+        <w:t xml:space="preserve">Platforming</w:t>
+      </w:r>
+    </w:p>
+    <w:p>
+      <w:pPr>
+        <w:numPr>
+          <w:ilvl w:val="1"/>
+          <w:numId w:val="2"/>
+        </w:numPr>
+        <w:ind w:left="1440" w:hanging="360"/>
+        <w:rPr>
+          <w:u w:val="none"/>
+        </w:rPr>
+      </w:pPr>
+      <w:r>
+        <w:rPr>
+          <w:rtl w:val="0"/>
+        </w:rPr>
+        <w:t xml:space="preserve">Combat, etc</w:t>
+      </w:r>
+    </w:p>
+    <w:p>
+      <w:pPr>
+        <w:numPr>
+          <w:ilvl w:val="0"/>
+          <w:numId w:val="2"/>
+        </w:numPr>
+        <w:ind w:left="720" w:hanging="360"/>
+        <w:rPr>
+          <w:u w:val="none"/>
+        </w:rPr>
+      </w:pPr>
+      <w:r>
+        <w:rPr>
+          <w:rtl w:val="0"/>
+        </w:rPr>
+        <w:t xml:space="preserve">Design story line/overall design</w:t>
+      </w:r>
+    </w:p>
+    <w:p>
+      <w:pPr>
+        <w:numPr>
+          <w:ilvl w:val="0"/>
+          <w:numId w:val="2"/>
+        </w:numPr>
+        <w:ind w:left="720" w:hanging="360"/>
+        <w:rPr>
+          <w:u w:val="none"/>
+        </w:rPr>
       </w:pPr>
       <w:r>
         <w:rPr>
           <w:rtl w:val="0"/>
         </w:rPr>
         <w:t xml:space="preserve">Set up GitHub repository</w:t>
-      </w:r>
-    </w:p>
-    <w:p>
-      <w:pPr>
-        <w:numPr>
-          <w:ilvl w:val="0"/>
-          <w:numId w:val="3"/>
-        </w:numPr>
-        <w:ind w:left="720" w:hanging="360"/>
-        <w:rPr/>
-      </w:pPr>
-      <w:r>
-        <w:rPr>
-          <w:rtl w:val="0"/>
-        </w:rPr>
-        <w:t xml:space="preserve">Test level setup</w:t>
-      </w:r>
-    </w:p>
-    <w:p>
-      <w:pPr>
-        <w:numPr>
-          <w:ilvl w:val="0"/>
-          <w:numId w:val="3"/>
-        </w:numPr>
-        <w:ind w:left="720" w:hanging="360"/>
-        <w:rPr/>
-      </w:pPr>
-      <w:r>
-        <w:rPr>
-          <w:rtl w:val="0"/>
-        </w:rPr>
-        <w:t xml:space="preserve">Enemy AI</w:t>
-      </w:r>
-    </w:p>
-    <w:p>
-      <w:pPr>
-        <w:numPr>
-          <w:ilvl w:val="0"/>
-          <w:numId w:val="3"/>
-        </w:numPr>
-        <w:ind w:left="720" w:hanging="360"/>
-        <w:rPr>
-          <w:u w:val="none"/>
-        </w:rPr>
-      </w:pPr>
-      <w:r>
-        <w:rPr>
-          <w:rtl w:val="0"/>
-        </w:rPr>
-        <w:t xml:space="preserve">Set up player model</w:t>
-      </w:r>
-    </w:p>
-    <w:p>
-      <w:pPr>
-        <w:numPr>
-          <w:ilvl w:val="0"/>
-          <w:numId w:val="3"/>
-        </w:numPr>
-        <w:ind w:left="720" w:hanging="360"/>
-        <w:rPr/>
-      </w:pPr>
-      <w:r>
-        <w:rPr>
-          <w:rtl w:val="0"/>
-        </w:rPr>
-        <w:t xml:space="preserve">Main menu system</w:t>
-      </w:r>
-    </w:p>
-    <w:p>
-      <w:pPr>
-        <w:numPr>
-          <w:ilvl w:val="1"/>
-          <w:numId w:val="3"/>
-        </w:numPr>
-        <w:ind w:left="1440" w:hanging="360"/>
-        <w:rPr/>
-      </w:pPr>
-      <w:r>
-        <w:rPr>
-          <w:rtl w:val="0"/>
-        </w:rPr>
-        <w:t xml:space="preserve">Death menu</w:t>
-      </w:r>
-    </w:p>
-    <w:p>
-      <w:pPr>
-        <w:numPr>
-          <w:ilvl w:val="1"/>
-          <w:numId w:val="3"/>
-        </w:numPr>
-        <w:ind w:left="1440" w:hanging="360"/>
-        <w:rPr/>
-      </w:pPr>
-      <w:r>
-        <w:rPr>
-          <w:rtl w:val="0"/>
-        </w:rPr>
-        <w:t xml:space="preserve">Interact key prompt UI</w:t>
-      </w:r>
-    </w:p>
-    <w:p>
-      <w:pPr>
-        <w:ind w:left="0" w:firstLine="0"/>
-        <w:rPr/>
-      </w:pPr>
-      <w:r>
-        <w:rPr>
-          <w:rtl w:val="0"/>
-        </w:rPr>
-      </w:r>
-    </w:p>
-    <w:p>
-      <w:pPr>
-        <w:rPr/>
-      </w:pPr>
-      <w:r>
-        <w:rPr>
-          <w:rtl w:val="0"/>
-        </w:rPr>
-        <w:t xml:space="preserve">Jiawei Song (jiaweis7):</w:t>
-      </w:r>
-    </w:p>
-    <w:p>
-      <w:pPr>
-        <w:numPr>
-          <w:ilvl w:val="0"/>
-          <w:numId w:val="4"/>
-        </w:numPr>
-        <w:ind w:left="720" w:hanging="360"/>
-        <w:rPr/>
-      </w:pPr>
-      <w:r>
-        <w:rPr>
-          <w:rtl w:val="0"/>
-        </w:rPr>
-        <w:t xml:space="preserve">Create mansion map</w:t>
-      </w:r>
-    </w:p>
-    <w:p>
-      <w:pPr>
-        <w:numPr>
-          <w:ilvl w:val="1"/>
-          <w:numId w:val="4"/>
-        </w:numPr>
-        <w:ind w:left="1440" w:hanging="360"/>
-        <w:rPr/>
-      </w:pPr>
-      <w:r>
-        <w:rPr>
-          <w:rtl w:val="0"/>
-        </w:rPr>
-        <w:t xml:space="preserve">Create mansion map textures and assets</w:t>
-      </w:r>
-    </w:p>
-    <w:p>
-      <w:pPr>
-        <w:numPr>
-          <w:ilvl w:val="1"/>
-          <w:numId w:val="4"/>
-        </w:numPr>
-        <w:ind w:left="1440" w:hanging="360"/>
-        <w:rPr/>
-      </w:pPr>
-      <w:r>
-        <w:rPr>
-          <w:rtl w:val="0"/>
-        </w:rPr>
-        <w:t xml:space="preserve">Add object interaction</w:t>
-      </w:r>
-    </w:p>
-    <w:p>
-      <w:pPr>
-        <w:numPr>
-          <w:ilvl w:val="0"/>
-          <w:numId w:val="4"/>
-        </w:numPr>
-        <w:ind w:left="720" w:hanging="360"/>
-        <w:rPr/>
-      </w:pPr>
-      <w:r>
-        <w:rPr>
-          <w:rtl w:val="0"/>
-        </w:rPr>
-        <w:t xml:space="preserve">Design features into game level</w:t>
-      </w:r>
-    </w:p>
-    <w:p>
-      <w:pPr>
-        <w:numPr>
-          <w:ilvl w:val="1"/>
-          <w:numId w:val="4"/>
-        </w:numPr>
-        <w:ind w:left="1440" w:hanging="360"/>
-        <w:rPr>
-          <w:u w:val="none"/>
-        </w:rPr>
-      </w:pPr>
-      <w:r>
-        <w:rPr>
-          <w:rtl w:val="0"/>
-        </w:rPr>
-        <w:t xml:space="preserve">Puzzles</w:t>
-      </w:r>
-    </w:p>
-    <w:p>
-      <w:pPr>
-        <w:numPr>
-          <w:ilvl w:val="1"/>
-          <w:numId w:val="4"/>
-        </w:numPr>
-        <w:ind w:left="1440" w:hanging="360"/>
-        <w:rPr>
-          <w:u w:val="none"/>
-        </w:rPr>
-      </w:pPr>
-      <w:r>
-        <w:rPr>
-          <w:rtl w:val="0"/>
-        </w:rPr>
-        <w:t xml:space="preserve">Platforming</w:t>
-      </w:r>
-    </w:p>
-    <w:p>
-      <w:pPr>
-        <w:numPr>
-          <w:ilvl w:val="1"/>
-          <w:numId w:val="4"/>
-        </w:numPr>
-        <w:ind w:left="1440" w:hanging="360"/>
-        <w:rPr>
-          <w:u w:val="none"/>
-        </w:rPr>
-      </w:pPr>
-      <w:r>
-        <w:rPr>
-          <w:rtl w:val="0"/>
-        </w:rPr>
-        <w:t xml:space="preserve">Combat, etc</w:t>
-      </w:r>
-    </w:p>
-    <w:p>
-      <w:pPr>
-        <w:numPr>
-          <w:ilvl w:val="0"/>
-          <w:numId w:val="4"/>
-        </w:numPr>
-        <w:ind w:left="720" w:hanging="360"/>
-        <w:rPr>
-          <w:u w:val="none"/>
-        </w:rPr>
-      </w:pPr>
-      <w:r>
-        <w:rPr>
-          <w:rtl w:val="0"/>
-        </w:rPr>
-        <w:t xml:space="preserve">Design story line/overall design</w:t>
         <w:br w:type="textWrapping"/>
       </w:r>
     </w:p>
@@ -561,7 +547,7 @@
     <w:lvl w:ilvl="1">
       <w:start w:val="1"/>
       <w:numFmt w:val="bullet"/>
-      <w:lvlText w:val="○"/>
+      <w:lvlText w:val="●"/>
       <w:lvlJc w:val="left"/>
       <w:pPr>
         <w:ind w:left="1440" w:hanging="360"/>
@@ -573,7 +559,7 @@
     <w:lvl w:ilvl="2">
       <w:start w:val="1"/>
       <w:numFmt w:val="bullet"/>
-      <w:lvlText w:val="■"/>
+      <w:lvlText w:val="●"/>
       <w:lvlJc w:val="left"/>
       <w:pPr>
         <w:ind w:left="2160" w:hanging="360"/>
@@ -597,7 +583,7 @@
     <w:lvl w:ilvl="4">
       <w:start w:val="1"/>
       <w:numFmt w:val="bullet"/>
-      <w:lvlText w:val="○"/>
+      <w:lvlText w:val="●"/>
       <w:lvlJc w:val="left"/>
       <w:pPr>
         <w:ind w:left="3600" w:hanging="360"/>
@@ -609,7 +595,7 @@
     <w:lvl w:ilvl="5">
       <w:start w:val="1"/>
       <w:numFmt w:val="bullet"/>
-      <w:lvlText w:val="■"/>
+      <w:lvlText w:val="●"/>
       <w:lvlJc w:val="left"/>
       <w:pPr>
         <w:ind w:left="4320" w:hanging="360"/>
@@ -633,7 +619,7 @@
     <w:lvl w:ilvl="7">
       <w:start w:val="1"/>
       <w:numFmt w:val="bullet"/>
-      <w:lvlText w:val="○"/>
+      <w:lvlText w:val="●"/>
       <w:lvlJc w:val="left"/>
       <w:pPr>
         <w:ind w:left="5760" w:hanging="360"/>
@@ -645,7 +631,7 @@
     <w:lvl w:ilvl="8">
       <w:start w:val="1"/>
       <w:numFmt w:val="bullet"/>
-      <w:lvlText w:val="■"/>
+      <w:lvlText w:val="●"/>
       <w:lvlJc w:val="left"/>
       <w:pPr>
         <w:ind w:left="6480" w:hanging="360"/>
@@ -671,7 +657,7 @@
     <w:lvl w:ilvl="1">
       <w:start w:val="1"/>
       <w:numFmt w:val="bullet"/>
-      <w:lvlText w:val="○"/>
+      <w:lvlText w:val="●"/>
       <w:lvlJc w:val="left"/>
       <w:pPr>
         <w:ind w:left="1440" w:hanging="360"/>
@@ -683,7 +669,7 @@
     <w:lvl w:ilvl="2">
       <w:start w:val="1"/>
       <w:numFmt w:val="bullet"/>
-      <w:lvlText w:val="■"/>
+      <w:lvlText w:val="●"/>
       <w:lvlJc w:val="left"/>
       <w:pPr>
         <w:ind w:left="2160" w:hanging="360"/>
@@ -707,7 +693,7 @@
     <w:lvl w:ilvl="4">
       <w:start w:val="1"/>
       <w:numFmt w:val="bullet"/>
-      <w:lvlText w:val="○"/>
+      <w:lvlText w:val="●"/>
       <w:lvlJc w:val="left"/>
       <w:pPr>
         <w:ind w:left="3600" w:hanging="360"/>
@@ -719,7 +705,7 @@
     <w:lvl w:ilvl="5">
       <w:start w:val="1"/>
       <w:numFmt w:val="bullet"/>
-      <w:lvlText w:val="■"/>
+      <w:lvlText w:val="●"/>
       <w:lvlJc w:val="left"/>
       <w:pPr>
         <w:ind w:left="4320" w:hanging="360"/>
@@ -743,7 +729,7 @@
     <w:lvl w:ilvl="7">
       <w:start w:val="1"/>
       <w:numFmt w:val="bullet"/>
-      <w:lvlText w:val="○"/>
+      <w:lvlText w:val="●"/>
       <w:lvlJc w:val="left"/>
       <w:pPr>
         <w:ind w:left="5760" w:hanging="360"/>
@@ -755,7 +741,7 @@
     <w:lvl w:ilvl="8">
       <w:start w:val="1"/>
       <w:numFmt w:val="bullet"/>
-      <w:lvlText w:val="■"/>
+      <w:lvlText w:val="●"/>
       <w:lvlJc w:val="left"/>
       <w:pPr>
         <w:ind w:left="6480" w:hanging="360"/>
@@ -781,7 +767,7 @@
     <w:lvl w:ilvl="1">
       <w:start w:val="1"/>
       <w:numFmt w:val="bullet"/>
-      <w:lvlText w:val="○"/>
+      <w:lvlText w:val="●"/>
       <w:lvlJc w:val="left"/>
       <w:pPr>
         <w:ind w:left="1440" w:hanging="360"/>
@@ -793,7 +779,7 @@
     <w:lvl w:ilvl="2">
       <w:start w:val="1"/>
       <w:numFmt w:val="bullet"/>
-      <w:lvlText w:val="■"/>
+      <w:lvlText w:val="●"/>
       <w:lvlJc w:val="left"/>
       <w:pPr>
         <w:ind w:left="2160" w:hanging="360"/>
@@ -817,7 +803,7 @@
     <w:lvl w:ilvl="4">
       <w:start w:val="1"/>
       <w:numFmt w:val="bullet"/>
-      <w:lvlText w:val="○"/>
+      <w:lvlText w:val="●"/>
       <w:lvlJc w:val="left"/>
       <w:pPr>
         <w:ind w:left="3600" w:hanging="360"/>
@@ -829,7 +815,7 @@
     <w:lvl w:ilvl="5">
       <w:start w:val="1"/>
       <w:numFmt w:val="bullet"/>
-      <w:lvlText w:val="■"/>
+      <w:lvlText w:val="●"/>
       <w:lvlJc w:val="left"/>
       <w:pPr>
         <w:ind w:left="4320" w:hanging="360"/>
@@ -853,7 +839,7 @@
     <w:lvl w:ilvl="7">
       <w:start w:val="1"/>
       <w:numFmt w:val="bullet"/>
-      <w:lvlText w:val="○"/>
+      <w:lvlText w:val="●"/>
       <w:lvlJc w:val="left"/>
       <w:pPr>
         <w:ind w:left="5760" w:hanging="360"/>
@@ -865,117 +851,7 @@
     <w:lvl w:ilvl="8">
       <w:start w:val="1"/>
       <w:numFmt w:val="bullet"/>
-      <w:lvlText w:val="■"/>
-      <w:lvlJc w:val="left"/>
-      <w:pPr>
-        <w:ind w:left="6480" w:hanging="360"/>
-      </w:pPr>
-      <w:rPr>
-        <w:u w:val="none"/>
-      </w:rPr>
-    </w:lvl>
-  </w:abstractNum>
-  <w:abstractNum w:abstractNumId="4">
-    <w:lvl w:ilvl="0">
-      <w:start w:val="1"/>
-      <w:numFmt w:val="bullet"/>
-      <w:lvlText w:val="●"/>
-      <w:lvlJc w:val="left"/>
-      <w:pPr>
-        <w:ind w:left="720" w:hanging="360"/>
-      </w:pPr>
-      <w:rPr>
-        <w:u w:val="none"/>
-      </w:rPr>
-    </w:lvl>
-    <w:lvl w:ilvl="1">
-      <w:start w:val="1"/>
-      <w:numFmt w:val="bullet"/>
-      <w:lvlText w:val="○"/>
-      <w:lvlJc w:val="left"/>
-      <w:pPr>
-        <w:ind w:left="1440" w:hanging="360"/>
-      </w:pPr>
-      <w:rPr>
-        <w:u w:val="none"/>
-      </w:rPr>
-    </w:lvl>
-    <w:lvl w:ilvl="2">
-      <w:start w:val="1"/>
-      <w:numFmt w:val="bullet"/>
-      <w:lvlText w:val="■"/>
-      <w:lvlJc w:val="left"/>
-      <w:pPr>
-        <w:ind w:left="2160" w:hanging="360"/>
-      </w:pPr>
-      <w:rPr>
-        <w:u w:val="none"/>
-      </w:rPr>
-    </w:lvl>
-    <w:lvl w:ilvl="3">
-      <w:start w:val="1"/>
-      <w:numFmt w:val="bullet"/>
-      <w:lvlText w:val="●"/>
-      <w:lvlJc w:val="left"/>
-      <w:pPr>
-        <w:ind w:left="2880" w:hanging="360"/>
-      </w:pPr>
-      <w:rPr>
-        <w:u w:val="none"/>
-      </w:rPr>
-    </w:lvl>
-    <w:lvl w:ilvl="4">
-      <w:start w:val="1"/>
-      <w:numFmt w:val="bullet"/>
-      <w:lvlText w:val="○"/>
-      <w:lvlJc w:val="left"/>
-      <w:pPr>
-        <w:ind w:left="3600" w:hanging="360"/>
-      </w:pPr>
-      <w:rPr>
-        <w:u w:val="none"/>
-      </w:rPr>
-    </w:lvl>
-    <w:lvl w:ilvl="5">
-      <w:start w:val="1"/>
-      <w:numFmt w:val="bullet"/>
-      <w:lvlText w:val="■"/>
-      <w:lvlJc w:val="left"/>
-      <w:pPr>
-        <w:ind w:left="4320" w:hanging="360"/>
-      </w:pPr>
-      <w:rPr>
-        <w:u w:val="none"/>
-      </w:rPr>
-    </w:lvl>
-    <w:lvl w:ilvl="6">
-      <w:start w:val="1"/>
-      <w:numFmt w:val="bullet"/>
-      <w:lvlText w:val="●"/>
-      <w:lvlJc w:val="left"/>
-      <w:pPr>
-        <w:ind w:left="5040" w:hanging="360"/>
-      </w:pPr>
-      <w:rPr>
-        <w:u w:val="none"/>
-      </w:rPr>
-    </w:lvl>
-    <w:lvl w:ilvl="7">
-      <w:start w:val="1"/>
-      <w:numFmt w:val="bullet"/>
-      <w:lvlText w:val="○"/>
-      <w:lvlJc w:val="left"/>
-      <w:pPr>
-        <w:ind w:left="5760" w:hanging="360"/>
-      </w:pPr>
-      <w:rPr>
-        <w:u w:val="none"/>
-      </w:rPr>
-    </w:lvl>
-    <w:lvl w:ilvl="8">
-      <w:start w:val="1"/>
-      <w:numFmt w:val="bullet"/>
-      <w:lvlText w:val="■"/>
+      <w:lvlText w:val="●"/>
       <w:lvlJc w:val="left"/>
       <w:pPr>
         <w:ind w:left="6480" w:hanging="360"/>
@@ -993,9 +869,6 @@
   </w:num>
   <w:num w:numId="3">
     <w:abstractNumId w:val="3"/>
-  </w:num>
-  <w:num w:numId="4">
-    <w:abstractNumId w:val="4"/>
   </w:num>
 </w:numbering>
 </file>

</xml_diff>